<commit_message>
Cleaned up the OTA
</commit_message>
<xml_diff>
--- a/Documentation/Manual/Gilboa Water Temperature Monitor.docx
+++ b/Documentation/Manual/Gilboa Water Temperature Monitor.docx
@@ -8,18 +8,16 @@
         <w:bidi w:val="0"/>
         <w:jc w:val="start"/>
         <w:rPr>
+          <w:sz w:val="32"/>
+          <w:szCs w:val="32"/>
+        </w:rPr>
+      </w:pPr>
+      <w:r>
+        <w:rPr>
           <w:b/>
           <w:bCs/>
-          <w:sz w:val="28"/>
-          <w:szCs w:val="28"/>
-        </w:rPr>
-      </w:pPr>
-      <w:r>
-        <w:rPr>
-          <w:b/>
-          <w:bCs/>
-          <w:sz w:val="28"/>
-          <w:szCs w:val="28"/>
+          <w:sz w:val="32"/>
+          <w:szCs w:val="32"/>
         </w:rPr>
         <w:t>Gilboa Water Temperature Monitor</w:t>
       </w:r>
@@ -1489,24 +1487,20 @@
         <w:ind w:hanging="0" w:start="0" w:end="0"/>
         <w:jc w:val="start"/>
         <w:rPr>
-          <w:rFonts w:ascii="Droid Sans Mono;monospace" w:hAnsi="Droid Sans Mono;monospace"/>
-          <w:b w:val="false"/>
-          <w:color w:val="008000"/>
-          <w:sz w:val="21"/>
-          <w:shd w:fill="FFFFFF" w:val="clear"/>
-        </w:rPr>
-      </w:pPr>
-      <w:r>
-        <w:rPr>
-          <w:rFonts w:ascii="Droid Sans Mono;monospace" w:hAnsi="Droid Sans Mono;monospace"/>
-          <w:b w:val="false"/>
-          <w:color w:val="008000"/>
+          <w:color w:val="2A6099"/>
+        </w:rPr>
+      </w:pPr>
+      <w:r>
+        <w:rPr>
+          <w:rFonts w:ascii="Droid Sans Mono;monospace" w:hAnsi="Droid Sans Mono;monospace"/>
+          <w:b w:val="false"/>
+          <w:color w:val="2A6099"/>
           <w:sz w:val="21"/>
           <w:shd w:fill="FFFFFF" w:val="clear"/>
         </w:rPr>
         <w:t xml:space="preserve">/debug-on </w:t>
         <w:tab/>
-        <w:t>Command to enable debug mode on the Sender  (not shown in help)</w:t>
+        <w:t xml:space="preserve">Command to enable debug mode on the Sender  </w:t>
       </w:r>
     </w:p>
     <w:p>
@@ -1517,24 +1511,20 @@
         <w:ind w:hanging="0" w:start="0" w:end="0"/>
         <w:jc w:val="start"/>
         <w:rPr>
-          <w:rFonts w:ascii="Droid Sans Mono;monospace" w:hAnsi="Droid Sans Mono;monospace"/>
-          <w:b w:val="false"/>
-          <w:color w:val="008000"/>
-          <w:sz w:val="21"/>
-          <w:shd w:fill="FFFFFF" w:val="clear"/>
-        </w:rPr>
-      </w:pPr>
-      <w:r>
-        <w:rPr>
-          <w:rFonts w:ascii="Droid Sans Mono;monospace" w:hAnsi="Droid Sans Mono;monospace"/>
-          <w:b w:val="false"/>
-          <w:color w:val="008000"/>
+          <w:color w:val="2A6099"/>
+        </w:rPr>
+      </w:pPr>
+      <w:r>
+        <w:rPr>
+          <w:rFonts w:ascii="Droid Sans Mono;monospace" w:hAnsi="Droid Sans Mono;monospace"/>
+          <w:b w:val="false"/>
+          <w:color w:val="2A6099"/>
           <w:sz w:val="21"/>
           <w:shd w:fill="FFFFFF" w:val="clear"/>
         </w:rPr>
         <w:t xml:space="preserve">/debug-off </w:t>
         <w:tab/>
-        <w:t>Command to disable debug mode on the Sender (not shown in help)</w:t>
+        <w:t>Command to disable debug mode on the Sender</w:t>
       </w:r>
     </w:p>
     <w:p>
@@ -1547,20 +1537,23 @@
         <w:rPr>
           <w:rFonts w:ascii="Droid Sans Mono;monospace" w:hAnsi="Droid Sans Mono;monospace"/>
           <w:b w:val="false"/>
-          <w:color w:val="008000"/>
-          <w:sz w:val="21"/>
-          <w:shd w:fill="FFFFFF" w:val="clear"/>
-        </w:rPr>
-      </w:pPr>
-      <w:r>
-        <w:rPr>
-          <w:rFonts w:ascii="Droid Sans Mono;monospace" w:hAnsi="Droid Sans Mono;monospace"/>
-          <w:b w:val="false"/>
-          <w:color w:val="008000"/>
-          <w:sz w:val="21"/>
-          <w:shd w:fill="FFFFFF" w:val="clear"/>
-        </w:rPr>
-        <w:t>/@DOWNLOAD@ Command to download firmware.bin on the Gilboa Github site to the Receiver.</w:t>
+          <w:color w:val="2A6099"/>
+          <w:sz w:val="21"/>
+          <w:shd w:fill="FFFFFF" w:val="clear"/>
+        </w:rPr>
+      </w:pPr>
+      <w:r>
+        <w:rPr>
+          <w:rFonts w:ascii="Droid Sans Mono;monospace" w:hAnsi="Droid Sans Mono;monospace"/>
+          <w:b w:val="false"/>
+          <w:color w:val="2A6099"/>
+          <w:sz w:val="21"/>
+          <w:shd w:fill="FFFFFF" w:val="clear"/>
+        </w:rPr>
+        <w:t xml:space="preserve">/ota </w:t>
+        <w:tab/>
+        <w:tab/>
+        <w:t xml:space="preserve">Show OTA partition information for Receiver </w:t>
       </w:r>
     </w:p>
     <w:p>
@@ -1571,24 +1564,40 @@
         <w:ind w:hanging="0" w:start="0" w:end="0"/>
         <w:jc w:val="start"/>
         <w:rPr>
-          <w:rFonts w:ascii="Droid Sans Mono;monospace" w:hAnsi="Droid Sans Mono;monospace"/>
-          <w:b w:val="false"/>
-          <w:color w:val="008000"/>
-          <w:sz w:val="21"/>
-          <w:shd w:fill="FFFFFF" w:val="clear"/>
-        </w:rPr>
-      </w:pPr>
-      <w:r>
-        <w:rPr>
-          <w:rFonts w:ascii="Droid Sans Mono;monospace" w:hAnsi="Droid Sans Mono;monospace"/>
-          <w:b w:val="false"/>
-          <w:color w:val="008000"/>
-          <w:sz w:val="21"/>
-          <w:shd w:fill="FFFFFF" w:val="clear"/>
-        </w:rPr>
-        <w:t>/@RESET@</w:t>
-        <w:tab/>
-        <w:t>Reset the Receiver (not shown in help)</w:t>
+          <w:color w:val="2A6099"/>
+        </w:rPr>
+      </w:pPr>
+      <w:r>
+        <w:rPr>
+          <w:rFonts w:ascii="Droid Sans Mono;monospace" w:hAnsi="Droid Sans Mono;monospace"/>
+          <w:b w:val="false"/>
+          <w:color w:val="2A6099"/>
+          <w:sz w:val="21"/>
+          <w:shd w:fill="FFFFFF" w:val="clear"/>
+        </w:rPr>
+        <w:t>/</w:t>
+      </w:r>
+      <w:r>
+        <w:rPr>
+          <w:rFonts w:ascii="Droid Sans Mono;monospace" w:hAnsi="Droid Sans Mono;monospace"/>
+          <w:b w:val="false"/>
+          <w:color w:val="2A6099"/>
+          <w:sz w:val="21"/>
+          <w:shd w:fill="FFFFFF" w:val="clear"/>
+        </w:rPr>
+        <w:t>*</w:t>
+      </w:r>
+      <w:r>
+        <w:rPr>
+          <w:rFonts w:ascii="Droid Sans Mono;monospace" w:hAnsi="Droid Sans Mono;monospace"/>
+          <w:b w:val="false"/>
+          <w:color w:val="2A6099"/>
+          <w:sz w:val="21"/>
+          <w:shd w:fill="FFFFFF" w:val="clear"/>
+        </w:rPr>
+        <w:t>UPDATE</w:t>
+        <w:tab/>
+        <w:t>Command to upload firmware.bin on the Gilboa Github site to the Receiver.</w:t>
       </w:r>
     </w:p>
     <w:p>
@@ -1599,25 +1608,40 @@
         <w:ind w:hanging="0" w:start="0" w:end="0"/>
         <w:jc w:val="start"/>
         <w:rPr>
-          <w:rFonts w:ascii="Droid Sans Mono;monospace" w:hAnsi="Droid Sans Mono;monospace"/>
-          <w:b w:val="false"/>
-          <w:color w:val="008000"/>
-          <w:sz w:val="21"/>
-          <w:shd w:fill="FFFFFF" w:val="clear"/>
-        </w:rPr>
-      </w:pPr>
-      <w:r>
-        <w:rPr>
-          <w:rFonts w:ascii="Droid Sans Mono;monospace" w:hAnsi="Droid Sans Mono;monospace"/>
-          <w:b w:val="false"/>
-          <w:color w:val="008000"/>
-          <w:sz w:val="21"/>
-          <w:shd w:fill="FFFFFF" w:val="clear"/>
-        </w:rPr>
-        <w:t xml:space="preserve">/help </w:t>
-        <w:tab/>
-        <w:tab/>
-        <w:t>Command to show available commands</w:t>
+          <w:color w:val="2A6099"/>
+        </w:rPr>
+      </w:pPr>
+      <w:r>
+        <w:rPr>
+          <w:rFonts w:ascii="Droid Sans Mono;monospace" w:hAnsi="Droid Sans Mono;monospace"/>
+          <w:b w:val="false"/>
+          <w:color w:val="2A6099"/>
+          <w:sz w:val="21"/>
+          <w:shd w:fill="FFFFFF" w:val="clear"/>
+        </w:rPr>
+        <w:t>/</w:t>
+      </w:r>
+      <w:r>
+        <w:rPr>
+          <w:rFonts w:ascii="Droid Sans Mono;monospace" w:hAnsi="Droid Sans Mono;monospace"/>
+          <w:b w:val="false"/>
+          <w:color w:val="2A6099"/>
+          <w:sz w:val="21"/>
+          <w:shd w:fill="FFFFFF" w:val="clear"/>
+        </w:rPr>
+        <w:t>*</w:t>
+      </w:r>
+      <w:r>
+        <w:rPr>
+          <w:rFonts w:ascii="Droid Sans Mono;monospace" w:hAnsi="Droid Sans Mono;monospace"/>
+          <w:b w:val="false"/>
+          <w:color w:val="2A6099"/>
+          <w:sz w:val="21"/>
+          <w:shd w:fill="FFFFFF" w:val="clear"/>
+        </w:rPr>
+        <w:t>RESET</w:t>
+        <w:tab/>
+        <w:t>Reset the Receiver (not shown in help)</w:t>
       </w:r>
     </w:p>
     <w:p>
@@ -1643,10 +1667,10 @@
           <w:sz w:val="21"/>
           <w:shd w:fill="FFFFFF" w:val="clear"/>
         </w:rPr>
-        <w:t>/start</w:t>
-        <w:tab/>
-        <w:tab/>
-        <w:t>same as /help</w:t>
+        <w:t xml:space="preserve">/help </w:t>
+        <w:tab/>
+        <w:tab/>
+        <w:t>Command to show safe commands (shown in green)</w:t>
       </w:r>
     </w:p>
     <w:p>
@@ -1672,10 +1696,65 @@
           <w:sz w:val="21"/>
           <w:shd w:fill="FFFFFF" w:val="clear"/>
         </w:rPr>
+        <w:t>/start</w:t>
+        <w:tab/>
+        <w:tab/>
+        <w:t>same as /help</w:t>
+      </w:r>
+    </w:p>
+    <w:p>
+      <w:pPr>
+        <w:pStyle w:val="Normal"/>
+        <w:bidi w:val="0"/>
+        <w:spacing w:lineRule="atLeast" w:line="285"/>
+        <w:ind w:hanging="0" w:start="0" w:end="0"/>
+        <w:jc w:val="start"/>
+        <w:rPr>
+          <w:rFonts w:ascii="Droid Sans Mono;monospace" w:hAnsi="Droid Sans Mono;monospace"/>
+          <w:b w:val="false"/>
+          <w:color w:val="008000"/>
+          <w:sz w:val="21"/>
+          <w:shd w:fill="FFFFFF" w:val="clear"/>
+        </w:rPr>
+      </w:pPr>
+      <w:r>
+        <w:rPr>
+          <w:rFonts w:ascii="Droid Sans Mono;monospace" w:hAnsi="Droid Sans Mono;monospace"/>
+          <w:b w:val="false"/>
+          <w:color w:val="008000"/>
+          <w:sz w:val="21"/>
+          <w:shd w:fill="FFFFFF" w:val="clear"/>
+        </w:rPr>
         <w:t>?</w:t>
         <w:tab/>
         <w:tab/>
         <w:t>Same as /help</w:t>
+      </w:r>
+    </w:p>
+    <w:p>
+      <w:pPr>
+        <w:pStyle w:val="Normal"/>
+        <w:spacing w:lineRule="atLeast" w:line="285"/>
+        <w:ind w:hanging="0" w:start="0" w:end="0"/>
+        <w:rPr>
+          <w:rFonts w:ascii="Droid Sans Mono;monospace" w:hAnsi="Droid Sans Mono;monospace"/>
+          <w:b w:val="false"/>
+          <w:color w:val="2A6099"/>
+          <w:sz w:val="21"/>
+          <w:shd w:fill="FFFFFF" w:val="clear"/>
+        </w:rPr>
+      </w:pPr>
+      <w:r>
+        <w:rPr>
+          <w:rFonts w:ascii="Droid Sans Mono;monospace" w:hAnsi="Droid Sans Mono;monospace"/>
+          <w:b w:val="false"/>
+          <w:color w:val="2A6099"/>
+          <w:sz w:val="21"/>
+          <w:shd w:fill="FFFFFF" w:val="clear"/>
+        </w:rPr>
+        <w:t>/superhelp</w:t>
+        <w:tab/>
+        <w:t>Command to show ALL available commands. (shown in green and in blue)</w:t>
       </w:r>
     </w:p>
     <w:p>
@@ -1784,25 +1863,25 @@
           <w:b/>
           <w:bCs/>
         </w:rPr>
-        <w:t>Downloading New Programs to the Sender by WiFi</w:t>
-      </w:r>
-    </w:p>
-    <w:p>
-      <w:pPr>
-        <w:pStyle w:val="Normal"/>
-        <w:bidi w:val="0"/>
-        <w:jc w:val="start"/>
-        <w:rPr>
-          <w:b w:val="false"/>
-          <w:bCs w:val="false"/>
-        </w:rPr>
-      </w:pPr>
-      <w:r>
-        <w:rPr>
-          <w:b w:val="false"/>
-          <w:bCs w:val="false"/>
-        </w:rPr>
-        <w:t>To download a new program to the Sender with out having to disassemble the unit to get at the USB connector, you can use the OTA by WiFi feature programmed into the Sender code.</w:t>
+        <w:t>Uploading New Programs to the Sender by WiFi</w:t>
+      </w:r>
+    </w:p>
+    <w:p>
+      <w:pPr>
+        <w:pStyle w:val="Normal"/>
+        <w:bidi w:val="0"/>
+        <w:jc w:val="start"/>
+        <w:rPr>
+          <w:b w:val="false"/>
+          <w:bCs w:val="false"/>
+        </w:rPr>
+      </w:pPr>
+      <w:r>
+        <w:rPr>
+          <w:b w:val="false"/>
+          <w:bCs w:val="false"/>
+        </w:rPr>
+        <w:t>To upload a new program to the Sender with out having to disassemble the unit to get at the USB connector, you can use the OTA by WiFi feature programmed into the Sender code.</w:t>
       </w:r>
     </w:p>
     <w:p>
@@ -1928,7 +2007,7 @@
           <w:b w:val="false"/>
           <w:bCs w:val="false"/>
         </w:rPr>
-        <w:t>Select the “Update” button. This will download the selected .bin file and reset tthe Sender. You will loose the WiFi connection when the Sender is reset.</w:t>
+        <w:t>Select the “Update” button. This will upload the selected .bin file and reset tthe Sender. You will loose the WiFi connection when the Sender is reset.</w:t>
       </w:r>
     </w:p>
     <w:p>
@@ -2024,25 +2103,25 @@
           <w:b/>
           <w:bCs/>
         </w:rPr>
-        <w:t>Downloading New Programs to the Receiver by USB using an Android</w:t>
-      </w:r>
-    </w:p>
-    <w:p>
-      <w:pPr>
-        <w:pStyle w:val="Normal"/>
-        <w:bidi w:val="0"/>
-        <w:jc w:val="start"/>
-        <w:rPr>
-          <w:b w:val="false"/>
-          <w:bCs w:val="false"/>
-        </w:rPr>
-      </w:pPr>
-      <w:r>
-        <w:rPr>
-          <w:b w:val="false"/>
-          <w:bCs w:val="false"/>
-        </w:rPr>
-        <w:t>To download a new program to the Receiver using the USB connector using an Android running the program ESBFlash.</w:t>
+        <w:t>Uploading New Programs to the Receiver by USB using an Android</w:t>
+      </w:r>
+    </w:p>
+    <w:p>
+      <w:pPr>
+        <w:pStyle w:val="Normal"/>
+        <w:bidi w:val="0"/>
+        <w:jc w:val="start"/>
+        <w:rPr>
+          <w:b w:val="false"/>
+          <w:bCs w:val="false"/>
+        </w:rPr>
+      </w:pPr>
+      <w:r>
+        <w:rPr>
+          <w:b w:val="false"/>
+          <w:bCs w:val="false"/>
+        </w:rPr>
+        <w:t>To upload a new program to the Receiver using the USB connector using an Android running the program ESBFlash.</w:t>
       </w:r>
     </w:p>
     <w:p>
@@ -2127,7 +2206,7 @@
           <w:b w:val="false"/>
           <w:bCs w:val="false"/>
         </w:rPr>
-        <w:t>Select the bin file to download by pressing the “+” nect to “Firmware File”, and choice the file to download.</w:t>
+        <w:t>Select the bin file to upload by pressing the “+” nect to “Firmware File”, and choice the file to upload.</w:t>
       </w:r>
     </w:p>
     <w:p>
@@ -2149,7 +2228,7 @@
           <w:b w:val="false"/>
           <w:bCs w:val="false"/>
         </w:rPr>
-        <w:t>A popup box will appear asking for the address where this bin file is to be downloaded to on the Receiver. Enter 0x10000.</w:t>
+        <w:t>A popup box will appear asking for the address where this bin file is to be uploaded to on the Receiver. Enter 0x10000.</w:t>
       </w:r>
     </w:p>
     <w:p>
@@ -2171,7 +2250,7 @@
           <w:b w:val="false"/>
           <w:bCs w:val="false"/>
         </w:rPr>
-        <w:t>Another popup box will appear as to what device is this bin file to be downloaded to. There will only be one device, select it.</w:t>
+        <w:t>Another popup box will appear as to what device is this bin file to be uploaded to. There will only be one device, select it.</w:t>
       </w:r>
     </w:p>
     <w:p>
@@ -2215,7 +2294,7 @@
           <w:b w:val="false"/>
           <w:bCs w:val="false"/>
         </w:rPr>
-        <w:t>Select the download icon.</w:t>
+        <w:t>Select the upload icon.</w:t>
       </w:r>
     </w:p>
     <w:p>
@@ -2265,27 +2344,19 @@
           <w:b/>
           <w:bCs/>
         </w:rPr>
-        <w:t>Downloading New Programs to the Receiver by Github</w:t>
-      </w:r>
-    </w:p>
-    <w:p>
-      <w:pPr>
-        <w:pStyle w:val="Normal"/>
-        <w:bidi w:val="0"/>
-        <w:jc w:val="start"/>
-        <w:rPr/>
-      </w:pPr>
-      <w:r>
-        <w:rPr/>
-        <w:t xml:space="preserve">DownloadIg a new program to the Receiver remotely by using Github and Telegram allows the user to download to and flash the Receuver a </w:t>
-      </w:r>
-      <w:r>
-        <w:rPr/>
-        <w:t>latest</w:t>
-      </w:r>
-      <w:r>
-        <w:rPr/>
-        <w:t xml:space="preserve"> compiled program.</w:t>
+        <w:t>Uploading New Programs to the Receiver by Github</w:t>
+      </w:r>
+    </w:p>
+    <w:p>
+      <w:pPr>
+        <w:pStyle w:val="Normal"/>
+        <w:bidi w:val="0"/>
+        <w:jc w:val="start"/>
+        <w:rPr/>
+      </w:pPr>
+      <w:r>
+        <w:rPr/>
+        <w:t>UploadIg a new program to the Receiver remotely by using Github and Telegram allows the user to upload to and flash the Receuver a latest compiled program.</w:t>
       </w:r>
     </w:p>
     <w:p>
@@ -2336,21 +2407,21 @@
           <w:b w:val="false"/>
           <w:bCs w:val="false"/>
         </w:rPr>
-        <w:t>Enter the command “/@</w:t>
-      </w:r>
-      <w:r>
-        <w:rPr>
-          <w:b w:val="false"/>
-          <w:bCs w:val="false"/>
-        </w:rPr>
-        <w:t>UPDATE</w:t>
-      </w:r>
-      <w:r>
-        <w:rPr>
-          <w:b w:val="false"/>
-          <w:bCs w:val="false"/>
-        </w:rPr>
-        <w:t>@”.</w:t>
+        <w:t>Enter the command “/</w:t>
+      </w:r>
+      <w:r>
+        <w:rPr>
+          <w:b w:val="false"/>
+          <w:bCs w:val="false"/>
+        </w:rPr>
+        <w:t>*</w:t>
+      </w:r>
+      <w:r>
+        <w:rPr>
+          <w:b w:val="false"/>
+          <w:bCs w:val="false"/>
+        </w:rPr>
+        <w:t>UPDATE”.</w:t>
       </w:r>
     </w:p>
     <w:p>
@@ -2366,25 +2437,32 @@
       </w:pPr>
       <w:r>
         <w:rPr/>
-        <w:t>This command will download the program firmware.bin, flash the ESP32 and then reset the ESP32.</w:t>
-      </w:r>
-    </w:p>
-    <w:p>
-      <w:pPr>
-        <w:pStyle w:val="Normal"/>
-        <w:bidi w:val="0"/>
-        <w:jc w:val="start"/>
-        <w:rPr>
-          <w:b w:val="false"/>
-          <w:bCs w:val="false"/>
-        </w:rPr>
-      </w:pPr>
-      <w:r>
-        <w:rPr>
-          <w:b w:val="false"/>
-          <w:bCs w:val="false"/>
-        </w:rPr>
-        <w:t>The location of the “firmware.bin” file is : “https://github.com/GilboaCode/Gilboa_Water_Temp/blob/main/Programs/Receiver/Running/firmware.bin”</w:t>
+        <w:t>This command will upload the program firmware.bin, flash the ESP32 and then reset the ESP32.</w:t>
+      </w:r>
+    </w:p>
+    <w:p>
+      <w:pPr>
+        <w:pStyle w:val="Normal"/>
+        <w:bidi w:val="0"/>
+        <w:jc w:val="start"/>
+        <w:rPr>
+          <w:b w:val="false"/>
+          <w:bCs w:val="false"/>
+        </w:rPr>
+      </w:pPr>
+      <w:r>
+        <w:rPr>
+          <w:b w:val="false"/>
+          <w:bCs w:val="false"/>
+        </w:rPr>
+        <w:t xml:space="preserve">The location of the “firmware.bin” file is </w:t>
+      </w:r>
+      <w:r>
+        <w:rPr>
+          <w:b w:val="false"/>
+          <w:bCs w:val="false"/>
+        </w:rPr>
+        <w:t>in the Github latest release of the Receiver.</w:t>
       </w:r>
     </w:p>
     <w:p>
@@ -3268,7 +3346,7 @@
     <w:pPr>
       <w:widowControl/>
       <w:suppressAutoHyphens w:val="true"/>
-      <w:overflowPunct w:val="false"/>
+      <w:overflowPunct w:val="true"/>
       <w:bidi w:val="0"/>
       <w:spacing w:before="0" w:after="0"/>
       <w:jc w:val="start"/>

</xml_diff>

<commit_message>
Changed the GitHub bin file name to Receiver_firmware.bin and Sender_firmware.bin.
</commit_message>
<xml_diff>
--- a/Documentation/Manual/Gilboa Water Temperature Monitor.docx
+++ b/Documentation/Manual/Gilboa Water Temperature Monitor.docx
@@ -1585,7 +1585,7 @@
           <w:sz w:val="21"/>
           <w:shd w:fill="FFFFFF" w:val="clear"/>
         </w:rPr>
-        <w:t>*</w:t>
+        <w:t>_</w:t>
       </w:r>
       <w:r>
         <w:rPr>
@@ -1629,7 +1629,7 @@
           <w:sz w:val="21"/>
           <w:shd w:fill="FFFFFF" w:val="clear"/>
         </w:rPr>
-        <w:t>*</w:t>
+        <w:t>_</w:t>
       </w:r>
       <w:r>
         <w:rPr>
@@ -2143,7 +2143,7 @@
           <w:b w:val="false"/>
           <w:bCs w:val="false"/>
         </w:rPr>
-        <w:t>Connect a USB-C male to USB-C male cable between the Receiver and the Android.</w:t>
+        <w:t>Before any binary file can be downloaded to the Receiver by USB, you need to know which slot is currently holding the Receiver program (slot 0 or slot 1). They each have their own starting address. Run the Telegram application on the Android.</w:t>
       </w:r>
     </w:p>
     <w:p>
@@ -2165,7 +2165,7 @@
           <w:b w:val="false"/>
           <w:bCs w:val="false"/>
         </w:rPr>
-        <w:t>Start the ESBFlash program on the Android.</w:t>
+        <w:t>Connect to “Gilboa_WaterTemp_bot.</w:t>
       </w:r>
     </w:p>
     <w:p>
@@ -2177,14 +2177,17 @@
         </w:numPr>
         <w:bidi w:val="0"/>
         <w:jc w:val="start"/>
-        <w:rPr/>
-      </w:pPr>
-      <w:r>
-        <w:rPr>
-          <w:b w:val="false"/>
-          <w:bCs w:val="false"/>
-        </w:rPr>
-        <w:t>Select the “Flash” icon at the bottom left hand side of the Android screen.</w:t>
+        <w:rPr>
+          <w:b w:val="false"/>
+          <w:bCs w:val="false"/>
+        </w:rPr>
+      </w:pPr>
+      <w:r>
+        <w:rPr>
+          <w:b w:val="false"/>
+          <w:bCs w:val="false"/>
+        </w:rPr>
+        <w:t>Enter the command “/ota”.</w:t>
       </w:r>
     </w:p>
     <w:p>
@@ -2206,7 +2209,7 @@
           <w:b w:val="false"/>
           <w:bCs w:val="false"/>
         </w:rPr>
-        <w:t>Select the bin file to upload by pressing the “+” nect to “Firmware File”, and choice the file to upload.</w:t>
+        <w:t>This will display the “Running partition” and it’s associated slot.</w:t>
       </w:r>
     </w:p>
     <w:p>
@@ -2228,7 +2231,7 @@
           <w:b w:val="false"/>
           <w:bCs w:val="false"/>
         </w:rPr>
-        <w:t>A popup box will appear asking for the address where this bin file is to be uploaded to on the Receiver. Enter 0x10000.</w:t>
+        <w:t>This slot will have an offset (10000 or 340000). Remember this offset.</w:t>
       </w:r>
     </w:p>
     <w:p>
@@ -2250,7 +2253,7 @@
           <w:b w:val="false"/>
           <w:bCs w:val="false"/>
         </w:rPr>
-        <w:t>Another popup box will appear as to what device is this bin file to be uploaded to. There will only be one device, select it.</w:t>
+        <w:t>Connect a USB-C male to USB-C male cable between the Receiver and the Android.</w:t>
       </w:r>
     </w:p>
     <w:p>
@@ -2272,7 +2275,7 @@
           <w:b w:val="false"/>
           <w:bCs w:val="false"/>
         </w:rPr>
-        <w:t>For the baud rate, enter 115200.</w:t>
+        <w:t>Start the ESBFlash program on the Android.</w:t>
       </w:r>
     </w:p>
     <w:p>
@@ -2284,6 +2287,127 @@
         </w:numPr>
         <w:bidi w:val="0"/>
         <w:jc w:val="start"/>
+        <w:rPr/>
+      </w:pPr>
+      <w:r>
+        <w:rPr>
+          <w:b w:val="false"/>
+          <w:bCs w:val="false"/>
+        </w:rPr>
+        <w:t>Select the “Flash” icon at the bottom left hand side of the Android screen.</w:t>
+      </w:r>
+    </w:p>
+    <w:p>
+      <w:pPr>
+        <w:pStyle w:val="Normal"/>
+        <w:numPr>
+          <w:ilvl w:val="0"/>
+          <w:numId w:val="5"/>
+        </w:numPr>
+        <w:bidi w:val="0"/>
+        <w:jc w:val="start"/>
+        <w:rPr>
+          <w:b w:val="false"/>
+          <w:bCs w:val="false"/>
+        </w:rPr>
+      </w:pPr>
+      <w:r>
+        <w:rPr>
+          <w:b w:val="false"/>
+          <w:bCs w:val="false"/>
+        </w:rPr>
+        <w:t>Select the bin file to upload by pressing the “+” nect to “Firmware File”, and choice the file to upload.</w:t>
+      </w:r>
+    </w:p>
+    <w:p>
+      <w:pPr>
+        <w:pStyle w:val="Normal"/>
+        <w:numPr>
+          <w:ilvl w:val="0"/>
+          <w:numId w:val="5"/>
+        </w:numPr>
+        <w:bidi w:val="0"/>
+        <w:jc w:val="start"/>
+        <w:rPr>
+          <w:b w:val="false"/>
+          <w:bCs w:val="false"/>
+        </w:rPr>
+      </w:pPr>
+      <w:r>
+        <w:rPr>
+          <w:b w:val="false"/>
+          <w:bCs w:val="false"/>
+        </w:rPr>
+        <w:t xml:space="preserve">A popup box will appear asking for the address where this bin file is to be uploaded to on the Receiver. Enter </w:t>
+      </w:r>
+      <w:r>
+        <w:rPr>
+          <w:b w:val="false"/>
+          <w:bCs w:val="false"/>
+        </w:rPr>
+        <w:t>the offset that was determined above.</w:t>
+      </w:r>
+      <w:r>
+        <w:rPr>
+          <w:b w:val="false"/>
+          <w:bCs w:val="false"/>
+        </w:rPr>
+        <w:t>.</w:t>
+      </w:r>
+    </w:p>
+    <w:p>
+      <w:pPr>
+        <w:pStyle w:val="Normal"/>
+        <w:numPr>
+          <w:ilvl w:val="0"/>
+          <w:numId w:val="5"/>
+        </w:numPr>
+        <w:bidi w:val="0"/>
+        <w:jc w:val="start"/>
+        <w:rPr>
+          <w:b w:val="false"/>
+          <w:bCs w:val="false"/>
+        </w:rPr>
+      </w:pPr>
+      <w:r>
+        <w:rPr>
+          <w:b w:val="false"/>
+          <w:bCs w:val="false"/>
+        </w:rPr>
+        <w:t>Another popup box will appear as to what device is this bin file to be uploaded to. There will only be one device, select it.</w:t>
+      </w:r>
+    </w:p>
+    <w:p>
+      <w:pPr>
+        <w:pStyle w:val="Normal"/>
+        <w:numPr>
+          <w:ilvl w:val="0"/>
+          <w:numId w:val="5"/>
+        </w:numPr>
+        <w:bidi w:val="0"/>
+        <w:jc w:val="start"/>
+        <w:rPr>
+          <w:b w:val="false"/>
+          <w:bCs w:val="false"/>
+        </w:rPr>
+      </w:pPr>
+      <w:r>
+        <w:rPr>
+          <w:b w:val="false"/>
+          <w:bCs w:val="false"/>
+        </w:rPr>
+        <w:t>For the baud rate, enter 115200.</w:t>
+      </w:r>
+    </w:p>
+    <w:p>
+      <w:pPr>
+        <w:pStyle w:val="Normal"/>
+        <w:numPr>
+          <w:ilvl w:val="0"/>
+          <w:numId w:val="5"/>
+        </w:numPr>
+        <w:bidi w:val="0"/>
+        <w:jc w:val="start"/>
         <w:rPr>
           <w:b w:val="false"/>
           <w:bCs w:val="false"/>
@@ -2414,7 +2538,7 @@
           <w:b w:val="false"/>
           <w:bCs w:val="false"/>
         </w:rPr>
-        <w:t>*</w:t>
+        <w:t>_</w:t>
       </w:r>
       <w:r>
         <w:rPr>
@@ -2455,14 +2579,7 @@
           <w:b w:val="false"/>
           <w:bCs w:val="false"/>
         </w:rPr>
-        <w:t xml:space="preserve">The location of the “firmware.bin” file is </w:t>
-      </w:r>
-      <w:r>
-        <w:rPr>
-          <w:b w:val="false"/>
-          <w:bCs w:val="false"/>
-        </w:rPr>
-        <w:t>in the Github latest release of the Receiver.</w:t>
+        <w:t>The location of the “firmware.bin” file is in the Github latest release of the Receiver.</w:t>
       </w:r>
     </w:p>
     <w:p>
@@ -3346,7 +3463,7 @@
     <w:pPr>
       <w:widowControl/>
       <w:suppressAutoHyphens w:val="true"/>
-      <w:overflowPunct w:val="true"/>
+      <w:overflowPunct w:val="false"/>
       <w:bidi w:val="0"/>
       <w:spacing w:before="0" w:after="0"/>
       <w:jc w:val="start"/>

</xml_diff>

<commit_message>
Added more debug statements to Sender WiFi startup.
</commit_message>
<xml_diff>
--- a/Documentation/Manual/Gilboa Water Temperature Monitor.docx
+++ b/Documentation/Manual/Gilboa Water Temperature Monitor.docx
@@ -423,14 +423,36 @@
       <w:pPr>
         <w:pStyle w:val="Normal"/>
         <w:bidi w:val="0"/>
-        <w:jc w:val="start"/>
-        <w:rPr/>
-      </w:pPr>
-      <w:r>
-        <w:rPr/>
-      </w:r>
-      <w:r>
-        <w:br w:type="page"/>
+        <w:spacing w:before="0" w:after="0"/>
+        <w:jc w:val="start"/>
+        <w:rPr>
+          <w:b/>
+          <w:bCs/>
+        </w:rPr>
+      </w:pPr>
+      <w:r>
+        <w:rPr>
+          <w:b/>
+          <w:bCs/>
+        </w:rPr>
+      </w:r>
+    </w:p>
+    <w:p>
+      <w:pPr>
+        <w:pStyle w:val="Normal"/>
+        <w:bidi w:val="0"/>
+        <w:spacing w:before="0" w:after="0"/>
+        <w:jc w:val="start"/>
+        <w:rPr>
+          <w:b/>
+          <w:bCs/>
+        </w:rPr>
+      </w:pPr>
+      <w:r>
+        <w:rPr>
+          <w:b/>
+          <w:bCs/>
+        </w:rPr>
       </w:r>
     </w:p>
     <w:p>
@@ -1535,11 +1557,7 @@
         <w:ind w:hanging="0" w:start="0" w:end="0"/>
         <w:jc w:val="start"/>
         <w:rPr>
-          <w:rFonts w:ascii="Droid Sans Mono;monospace" w:hAnsi="Droid Sans Mono;monospace"/>
-          <w:b w:val="false"/>
           <w:color w:val="2A6099"/>
-          <w:sz w:val="21"/>
-          <w:shd w:fill="FFFFFF" w:val="clear"/>
         </w:rPr>
       </w:pPr>
       <w:r>
@@ -1550,10 +1568,9 @@
           <w:sz w:val="21"/>
           <w:shd w:fill="FFFFFF" w:val="clear"/>
         </w:rPr>
-        <w:t xml:space="preserve">/ota </w:t>
-        <w:tab/>
-        <w:tab/>
-        <w:t xml:space="preserve">Show OTA partition information for Receiver </w:t>
+        <w:t>/WDT-on</w:t>
+        <w:tab/>
+        <w:t>Receiver’s Watchdog timer on</w:t>
       </w:r>
     </w:p>
     <w:p>
@@ -1575,29 +1592,9 @@
           <w:sz w:val="21"/>
           <w:shd w:fill="FFFFFF" w:val="clear"/>
         </w:rPr>
-        <w:t>/</w:t>
-      </w:r>
-      <w:r>
-        <w:rPr>
-          <w:rFonts w:ascii="Droid Sans Mono;monospace" w:hAnsi="Droid Sans Mono;monospace"/>
-          <w:b w:val="false"/>
-          <w:color w:val="2A6099"/>
-          <w:sz w:val="21"/>
-          <w:shd w:fill="FFFFFF" w:val="clear"/>
-        </w:rPr>
-        <w:t>_</w:t>
-      </w:r>
-      <w:r>
-        <w:rPr>
-          <w:rFonts w:ascii="Droid Sans Mono;monospace" w:hAnsi="Droid Sans Mono;monospace"/>
-          <w:b w:val="false"/>
-          <w:color w:val="2A6099"/>
-          <w:sz w:val="21"/>
-          <w:shd w:fill="FFFFFF" w:val="clear"/>
-        </w:rPr>
-        <w:t>UPDATE</w:t>
-        <w:tab/>
-        <w:t>Command to upload firmware.bin on the Gilboa Github site to the Receiver.</w:t>
+        <w:t>/WDT-off</w:t>
+        <w:tab/>
+        <w:t>Receiver’s Watchdog timer off</w:t>
       </w:r>
     </w:p>
     <w:p>
@@ -1608,7 +1605,11 @@
         <w:ind w:hanging="0" w:start="0" w:end="0"/>
         <w:jc w:val="start"/>
         <w:rPr>
+          <w:rFonts w:ascii="Droid Sans Mono;monospace" w:hAnsi="Droid Sans Mono;monospace"/>
+          <w:b w:val="false"/>
           <w:color w:val="2A6099"/>
+          <w:sz w:val="21"/>
+          <w:shd w:fill="FFFFFF" w:val="clear"/>
         </w:rPr>
       </w:pPr>
       <w:r>
@@ -1619,18 +1620,23 @@
           <w:sz w:val="21"/>
           <w:shd w:fill="FFFFFF" w:val="clear"/>
         </w:rPr>
-        <w:t>/</w:t>
-      </w:r>
-      <w:r>
-        <w:rPr>
-          <w:rFonts w:ascii="Droid Sans Mono;monospace" w:hAnsi="Droid Sans Mono;monospace"/>
-          <w:b w:val="false"/>
+        <w:t xml:space="preserve">/ota </w:t>
+        <w:tab/>
+        <w:tab/>
+        <w:t xml:space="preserve">Show OTA partition information for Receiver </w:t>
+      </w:r>
+    </w:p>
+    <w:p>
+      <w:pPr>
+        <w:pStyle w:val="Normal"/>
+        <w:bidi w:val="0"/>
+        <w:spacing w:lineRule="atLeast" w:line="285"/>
+        <w:ind w:hanging="0" w:start="0" w:end="0"/>
+        <w:jc w:val="start"/>
+        <w:rPr>
           <w:color w:val="2A6099"/>
-          <w:sz w:val="21"/>
-          <w:shd w:fill="FFFFFF" w:val="clear"/>
-        </w:rPr>
-        <w:t>_</w:t>
-      </w:r>
+        </w:rPr>
+      </w:pPr>
       <w:r>
         <w:rPr>
           <w:rFonts w:ascii="Droid Sans Mono;monospace" w:hAnsi="Droid Sans Mono;monospace"/>
@@ -1639,7 +1645,31 @@
           <w:sz w:val="21"/>
           <w:shd w:fill="FFFFFF" w:val="clear"/>
         </w:rPr>
-        <w:t>RESET</w:t>
+        <w:t>/_UPDATE</w:t>
+        <w:tab/>
+        <w:t>Command to upload firmware.bin on the Gilboa Github site to the Receiver.</w:t>
+      </w:r>
+    </w:p>
+    <w:p>
+      <w:pPr>
+        <w:pStyle w:val="Normal"/>
+        <w:bidi w:val="0"/>
+        <w:spacing w:lineRule="atLeast" w:line="285"/>
+        <w:ind w:hanging="0" w:start="0" w:end="0"/>
+        <w:jc w:val="start"/>
+        <w:rPr>
+          <w:color w:val="2A6099"/>
+        </w:rPr>
+      </w:pPr>
+      <w:r>
+        <w:rPr>
+          <w:rFonts w:ascii="Droid Sans Mono;monospace" w:hAnsi="Droid Sans Mono;monospace"/>
+          <w:b w:val="false"/>
+          <w:color w:val="2A6099"/>
+          <w:sz w:val="21"/>
+          <w:shd w:fill="FFFFFF" w:val="clear"/>
+        </w:rPr>
+        <w:t>/_RESET</w:t>
         <w:tab/>
         <w:t>Reset the Receiver (not shown in help)</w:t>
       </w:r>
@@ -1963,7 +1993,21 @@
           <w:b w:val="false"/>
           <w:bCs w:val="false"/>
         </w:rPr>
-        <w:t>From a web browser, go to the site “192.168.1.2/update”, to connect to the Sender unit.</w:t>
+        <w:t>From a web browser, go to the site “192.168.</w:t>
+      </w:r>
+      <w:r>
+        <w:rPr>
+          <w:b w:val="false"/>
+          <w:bCs w:val="false"/>
+        </w:rPr>
+        <w:t>4</w:t>
+      </w:r>
+      <w:r>
+        <w:rPr>
+          <w:b w:val="false"/>
+          <w:bCs w:val="false"/>
+        </w:rPr>
+        <w:t>.2/update”, to connect to the Sender unit.</w:t>
       </w:r>
     </w:p>
     <w:p>
@@ -2338,21 +2382,7 @@
           <w:b w:val="false"/>
           <w:bCs w:val="false"/>
         </w:rPr>
-        <w:t xml:space="preserve">A popup box will appear asking for the address where this bin file is to be uploaded to on the Receiver. Enter </w:t>
-      </w:r>
-      <w:r>
-        <w:rPr>
-          <w:b w:val="false"/>
-          <w:bCs w:val="false"/>
-        </w:rPr>
-        <w:t>the offset that was determined above.</w:t>
-      </w:r>
-      <w:r>
-        <w:rPr>
-          <w:b w:val="false"/>
-          <w:bCs w:val="false"/>
-        </w:rPr>
-        <w:t>.</w:t>
+        <w:t>A popup box will appear asking for the address where this bin file is to be uploaded to on the Receiver. Enter the offset that was determined above..</w:t>
       </w:r>
     </w:p>
     <w:p>
@@ -2480,7 +2510,7 @@
       </w:pPr>
       <w:r>
         <w:rPr/>
-        <w:t>UploadIg a new program to the Receiver remotely by using Github and Telegram allows the user to upload to and flash the Receuver a latest compiled program.</w:t>
+        <w:t>UploadIg a new program to the Receiver remotely by using Github and Telegram allows the user to upload to and flash the Receiver with the latest “Released” program.</w:t>
       </w:r>
     </w:p>
     <w:p>
@@ -2496,7 +2526,7 @@
       </w:pPr>
       <w:r>
         <w:rPr/>
-        <w:t>After compiling the new Receiver program, move the .bin file to the Github location of https://github.com/GilboaCode/Gilboa_Water_Temp/tree/main/Programs/Receiver/Running as firmware.bin.</w:t>
+        <w:t>From theTelegram application, connect to “Gilboa_WaterTemp”.</w:t>
       </w:r>
     </w:p>
     <w:p>
@@ -2511,8 +2541,11 @@
         <w:rPr/>
       </w:pPr>
       <w:r>
-        <w:rPr/>
-        <w:t>From theTelegram application, connect to “Gilboa_WaterTemp”.</w:t>
+        <w:rPr>
+          <w:b w:val="false"/>
+          <w:bCs w:val="false"/>
+        </w:rPr>
+        <w:t>Enter the command “/_UPDATE”.</w:t>
       </w:r>
     </w:p>
     <w:p>
@@ -2527,25 +2560,211 @@
         <w:rPr/>
       </w:pPr>
       <w:r>
-        <w:rPr>
-          <w:b w:val="false"/>
-          <w:bCs w:val="false"/>
-        </w:rPr>
-        <w:t>Enter the command “/</w:t>
-      </w:r>
-      <w:r>
-        <w:rPr>
-          <w:b w:val="false"/>
-          <w:bCs w:val="false"/>
-        </w:rPr>
-        <w:t>_</w:t>
-      </w:r>
-      <w:r>
-        <w:rPr>
-          <w:b w:val="false"/>
-          <w:bCs w:val="false"/>
-        </w:rPr>
-        <w:t>UPDATE”.</w:t>
+        <w:rPr/>
+        <w:t>This command will upload the program Receiver_firmware.bin from the “</w:t>
+      </w:r>
+      <w:r>
+        <w:rPr>
+          <w:b/>
+          <w:bCs/>
+        </w:rPr>
+        <w:t>Gilboa_Water_Temp</w:t>
+      </w:r>
+      <w:r>
+        <w:rPr/>
+        <w:t>” repository, flash and then reset the ESP32.</w:t>
+      </w:r>
+    </w:p>
+    <w:p>
+      <w:pPr>
+        <w:pStyle w:val="Normal"/>
+        <w:bidi w:val="0"/>
+        <w:jc w:val="start"/>
+        <w:rPr>
+          <w:b w:val="false"/>
+          <w:bCs w:val="false"/>
+        </w:rPr>
+      </w:pPr>
+      <w:r>
+        <w:rPr>
+          <w:b w:val="false"/>
+          <w:bCs w:val="false"/>
+        </w:rPr>
+        <w:t>The location of the “Receiver_firmware.bin” file is in the Github latest release of the Receiver.</w:t>
+      </w:r>
+    </w:p>
+    <w:p>
+      <w:pPr>
+        <w:pStyle w:val="Normal"/>
+        <w:bidi w:val="0"/>
+        <w:jc w:val="start"/>
+        <w:rPr>
+          <w:b w:val="false"/>
+          <w:bCs w:val="false"/>
+        </w:rPr>
+      </w:pPr>
+      <w:r>
+        <w:rPr>
+          <w:b w:val="false"/>
+          <w:bCs w:val="false"/>
+        </w:rPr>
+      </w:r>
+    </w:p>
+    <w:p>
+      <w:pPr>
+        <w:pStyle w:val="Normal"/>
+        <w:rPr>
+          <w:b/>
+          <w:bCs/>
+        </w:rPr>
+      </w:pPr>
+      <w:r>
+        <w:rPr>
+          <w:b/>
+          <w:bCs/>
+        </w:rPr>
+        <w:t>Modifing the files in the GitHub Repository</w:t>
+      </w:r>
+    </w:p>
+    <w:p>
+      <w:pPr>
+        <w:pStyle w:val="Normal"/>
+        <w:bidi w:val="0"/>
+        <w:jc w:val="start"/>
+        <w:rPr>
+          <w:b w:val="false"/>
+          <w:bCs w:val="false"/>
+        </w:rPr>
+      </w:pPr>
+      <w:r>
+        <w:rPr>
+          <w:b w:val="false"/>
+          <w:bCs w:val="false"/>
+        </w:rPr>
+        <w:t>The name of the Repository is “</w:t>
+      </w:r>
+      <w:r>
+        <w:rPr>
+          <w:b/>
+          <w:bCs/>
+        </w:rPr>
+        <w:t>Gilboa_Water_Temp</w:t>
+      </w:r>
+      <w:r>
+        <w:rPr>
+          <w:b w:val="false"/>
+          <w:bCs w:val="false"/>
+        </w:rPr>
+        <w:t>”. The directoy structure is:</w:t>
+      </w:r>
+    </w:p>
+    <w:p>
+      <w:pPr>
+        <w:pStyle w:val="Normal"/>
+        <w:bidi w:val="0"/>
+        <w:jc w:val="start"/>
+        <w:rPr>
+          <w:b w:val="false"/>
+          <w:bCs w:val="false"/>
+        </w:rPr>
+      </w:pPr>
+      <w:r>
+        <w:rPr>
+          <w:b w:val="false"/>
+          <w:bCs w:val="false"/>
+        </w:rPr>
+        <w:tab/>
+        <w:t>Documentation</w:t>
+        <w:tab/>
+        <w:t>- All documentation</w:t>
+      </w:r>
+    </w:p>
+    <w:p>
+      <w:pPr>
+        <w:pStyle w:val="Normal"/>
+        <w:bidi w:val="0"/>
+        <w:jc w:val="start"/>
+        <w:rPr/>
+      </w:pPr>
+      <w:r>
+        <w:rPr>
+          <w:b w:val="false"/>
+          <w:bCs w:val="false"/>
+        </w:rPr>
+        <w:tab/>
+        <w:t>Freecad</w:t>
+        <w:tab/>
+        <w:tab/>
+        <w:t>- Freecad files for all 3d printed objects</w:t>
+      </w:r>
+    </w:p>
+    <w:p>
+      <w:pPr>
+        <w:pStyle w:val="Normal"/>
+        <w:bidi w:val="0"/>
+        <w:jc w:val="start"/>
+        <w:rPr/>
+      </w:pPr>
+      <w:r>
+        <w:rPr>
+          <w:b w:val="false"/>
+          <w:bCs w:val="false"/>
+        </w:rPr>
+        <w:tab/>
+        <w:t>KiCAD</w:t>
+        <w:tab/>
+        <w:tab/>
+        <w:t>- Schematics for all electronic circuits</w:t>
+      </w:r>
+    </w:p>
+    <w:p>
+      <w:pPr>
+        <w:pStyle w:val="Normal"/>
+        <w:bidi w:val="0"/>
+        <w:jc w:val="start"/>
+        <w:rPr/>
+      </w:pPr>
+      <w:r>
+        <w:rPr>
+          <w:b w:val="false"/>
+          <w:bCs w:val="false"/>
+        </w:rPr>
+        <w:tab/>
+        <w:t>Visual_Studio_Code</w:t>
+        <w:tab/>
+        <w:t>- All C++ code for the Sender and Receiver</w:t>
+      </w:r>
+    </w:p>
+    <w:p>
+      <w:pPr>
+        <w:pStyle w:val="Normal"/>
+        <w:bidi w:val="0"/>
+        <w:jc w:val="start"/>
+        <w:rPr>
+          <w:b w:val="false"/>
+          <w:bCs w:val="false"/>
+        </w:rPr>
+      </w:pPr>
+      <w:r>
+        <w:rPr>
+          <w:b w:val="false"/>
+          <w:bCs w:val="false"/>
+        </w:rPr>
+      </w:r>
+    </w:p>
+    <w:p>
+      <w:pPr>
+        <w:pStyle w:val="Normal"/>
+        <w:bidi w:val="0"/>
+        <w:jc w:val="start"/>
+        <w:rPr/>
+      </w:pPr>
+      <w:r>
+        <w:rPr>
+          <w:b w:val="false"/>
+          <w:bCs w:val="false"/>
+        </w:rPr>
+        <w:t>Git and GitHub are used on all files within Gilboa_Water_Temp. After a file is modified:</w:t>
       </w:r>
     </w:p>
     <w:p>
@@ -2553,56 +2772,188 @@
         <w:pStyle w:val="Normal"/>
         <w:numPr>
           <w:ilvl w:val="0"/>
-          <w:numId w:val="5"/>
-        </w:numPr>
-        <w:bidi w:val="0"/>
-        <w:jc w:val="start"/>
-        <w:rPr/>
-      </w:pPr>
-      <w:r>
-        <w:rPr/>
-        <w:t>This command will upload the program firmware.bin, flash the ESP32 and then reset the ESP32.</w:t>
-      </w:r>
-    </w:p>
-    <w:p>
-      <w:pPr>
-        <w:pStyle w:val="Normal"/>
-        <w:bidi w:val="0"/>
-        <w:jc w:val="start"/>
-        <w:rPr>
-          <w:b w:val="false"/>
-          <w:bCs w:val="false"/>
-        </w:rPr>
-      </w:pPr>
-      <w:r>
-        <w:rPr>
-          <w:b w:val="false"/>
-          <w:bCs w:val="false"/>
-        </w:rPr>
-        <w:t>The location of the “firmware.bin” file is in the Github latest release of the Receiver.</w:t>
-      </w:r>
-    </w:p>
-    <w:p>
-      <w:pPr>
-        <w:pStyle w:val="Normal"/>
-        <w:bidi w:val="0"/>
-        <w:jc w:val="start"/>
-        <w:rPr>
-          <w:b w:val="false"/>
-          <w:bCs w:val="false"/>
-        </w:rPr>
-      </w:pPr>
-      <w:r>
-        <w:rPr>
-          <w:b w:val="false"/>
-          <w:bCs w:val="false"/>
+          <w:numId w:val="6"/>
+        </w:numPr>
+        <w:bidi w:val="0"/>
+        <w:jc w:val="start"/>
+        <w:rPr/>
+      </w:pPr>
+      <w:r>
+        <w:rPr>
+          <w:b w:val="false"/>
+          <w:bCs w:val="false"/>
+        </w:rPr>
+        <w:t>Save changes to your local directory (your directory should be identical to the one above).</w:t>
+      </w:r>
+    </w:p>
+    <w:p>
+      <w:pPr>
+        <w:pStyle w:val="Normal"/>
+        <w:numPr>
+          <w:ilvl w:val="0"/>
+          <w:numId w:val="6"/>
+        </w:numPr>
+        <w:bidi w:val="0"/>
+        <w:jc w:val="start"/>
+        <w:rPr/>
+      </w:pPr>
+      <w:r>
+        <w:rPr>
+          <w:b w:val="false"/>
+          <w:bCs w:val="false"/>
+        </w:rPr>
+        <w:t>Stage all files.</w:t>
+      </w:r>
+    </w:p>
+    <w:p>
+      <w:pPr>
+        <w:pStyle w:val="Normal"/>
+        <w:numPr>
+          <w:ilvl w:val="0"/>
+          <w:numId w:val="6"/>
+        </w:numPr>
+        <w:bidi w:val="0"/>
+        <w:jc w:val="start"/>
+        <w:rPr/>
+      </w:pPr>
+      <w:r>
+        <w:rPr>
+          <w:b w:val="false"/>
+          <w:bCs w:val="false"/>
+        </w:rPr>
+        <w:t>Commit the files with a message.</w:t>
+      </w:r>
+    </w:p>
+    <w:p>
+      <w:pPr>
+        <w:pStyle w:val="Normal"/>
+        <w:numPr>
+          <w:ilvl w:val="0"/>
+          <w:numId w:val="6"/>
+        </w:numPr>
+        <w:bidi w:val="0"/>
+        <w:jc w:val="start"/>
+        <w:rPr/>
+      </w:pPr>
+      <w:r>
+        <w:rPr>
+          <w:b w:val="false"/>
+          <w:bCs w:val="false"/>
+        </w:rPr>
+        <w:t>Within GitHub, select the “Release” function.</w:t>
+      </w:r>
+    </w:p>
+    <w:p>
+      <w:pPr>
+        <w:pStyle w:val="Normal"/>
+        <w:numPr>
+          <w:ilvl w:val="1"/>
+          <w:numId w:val="6"/>
+        </w:numPr>
+        <w:bidi w:val="0"/>
+        <w:jc w:val="start"/>
+        <w:rPr/>
+      </w:pPr>
+      <w:r>
+        <w:rPr>
+          <w:b w:val="false"/>
+          <w:bCs w:val="false"/>
+        </w:rPr>
+        <w:t>Enter a tag name of the next release number (i.e. Release_4).</w:t>
+      </w:r>
+    </w:p>
+    <w:p>
+      <w:pPr>
+        <w:pStyle w:val="Normal"/>
+        <w:numPr>
+          <w:ilvl w:val="1"/>
+          <w:numId w:val="6"/>
+        </w:numPr>
+        <w:bidi w:val="0"/>
+        <w:jc w:val="start"/>
+        <w:rPr/>
+      </w:pPr>
+      <w:r>
+        <w:rPr>
+          <w:b w:val="false"/>
+          <w:bCs w:val="false"/>
+        </w:rPr>
+        <w:t>Enter a release name of the “release number – Receiver version number – Sender version number” (i.e.</w:t>
+      </w:r>
+      <w:r>
+        <w:rPr>
+          <w:rFonts w:eastAsia="Noto Serif CJK SC" w:cs="Noto Sans Devanagari"/>
+          <w:b w:val="false"/>
+          <w:bCs w:val="false"/>
+          <w:color w:val="auto"/>
+          <w:kern w:val="2"/>
+          <w:sz w:val="24"/>
+          <w:szCs w:val="24"/>
+          <w:lang w:val="en-US" w:eastAsia="zh-CN" w:bidi="hi-IN"/>
+        </w:rPr>
+        <w:t xml:space="preserve">  “Release 2 - Receiver v1.3.02 - Sender v1.2.03”).</w:t>
+      </w:r>
+    </w:p>
+    <w:p>
+      <w:pPr>
+        <w:pStyle w:val="Normal"/>
+        <w:numPr>
+          <w:ilvl w:val="1"/>
+          <w:numId w:val="6"/>
+        </w:numPr>
+        <w:bidi w:val="0"/>
+        <w:jc w:val="start"/>
+        <w:rPr/>
+      </w:pPr>
+      <w:r>
+        <w:rPr>
+          <w:rFonts w:eastAsia="Noto Serif CJK SC" w:cs="Noto Sans Devanagari"/>
+          <w:b w:val="false"/>
+          <w:bCs w:val="false"/>
+          <w:color w:val="auto"/>
+          <w:kern w:val="2"/>
+          <w:sz w:val="24"/>
+          <w:szCs w:val="24"/>
+          <w:lang w:val="en-US" w:eastAsia="zh-CN" w:bidi="hi-IN"/>
+        </w:rPr>
+        <w:t>Attach the binaries (firmware.bin) for the Receiver and Sender. Renaming them with their corresponding target (Receiver_irmware.bin and Sender_firmware.bin).</w:t>
+      </w:r>
+    </w:p>
+    <w:p>
+      <w:pPr>
+        <w:pStyle w:val="Normal"/>
+        <w:bidi w:val="0"/>
+        <w:jc w:val="start"/>
+        <w:rPr>
+          <w:rFonts w:ascii="Liberation Serif" w:hAnsi="Liberation Serif" w:eastAsia="Noto Serif CJK SC" w:cs="Noto Sans Devanagari"/>
+          <w:b w:val="false"/>
+          <w:bCs w:val="false"/>
+          <w:color w:val="auto"/>
+          <w:kern w:val="2"/>
+          <w:sz w:val="24"/>
+          <w:szCs w:val="24"/>
+          <w:lang w:val="en-US" w:eastAsia="zh-CN" w:bidi="hi-IN"/>
+        </w:rPr>
+      </w:pPr>
+      <w:r>
+        <w:rPr>
+          <w:rFonts w:eastAsia="Noto Serif CJK SC" w:cs="Noto Sans Devanagari"/>
+          <w:b w:val="false"/>
+          <w:bCs w:val="false"/>
+          <w:color w:val="auto"/>
+          <w:kern w:val="2"/>
+          <w:sz w:val="24"/>
+          <w:szCs w:val="24"/>
+          <w:lang w:val="en-US" w:eastAsia="zh-CN" w:bidi="hi-IN"/>
         </w:rPr>
       </w:r>
     </w:p>
     <w:sectPr>
+      <w:footerReference w:type="even" r:id="rId5"/>
+      <w:footerReference w:type="default" r:id="rId6"/>
       <w:type w:val="nextPage"/>
-      <w:pgSz w:w="11906" w:h="16838"/>
-      <w:pgMar w:left="1134" w:right="1134" w:gutter="0" w:header="0" w:top="1134" w:footer="0" w:bottom="1134"/>
+      <w:pgSz w:w="12240" w:h="15840"/>
+      <w:pgMar w:left="1134" w:right="1134" w:gutter="0" w:header="0" w:top="1134" w:footer="1134" w:bottom="1693"/>
       <w:pgNumType w:fmt="decimal"/>
       <w:formProt w:val="false"/>
       <w:textDirection w:val="lrTb"/>
@@ -2612,6 +2963,74 @@
 </w:document>
 </file>
 
+<file path=word/footer1.xml><?xml version="1.0" encoding="utf-8"?>
+<w:ftr xmlns:o="urn:schemas-microsoft-com:office:office" xmlns:r="http://schemas.openxmlformats.org/officeDocument/2006/relationships" xmlns:v="urn:schemas-microsoft-com:vml" xmlns:w="http://schemas.openxmlformats.org/wordprocessingml/2006/main" xmlns:w10="urn:schemas-microsoft-com:office:word" xmlns:wp="http://schemas.openxmlformats.org/drawingml/2006/wordprocessingDrawing" xmlns:wps="http://schemas.microsoft.com/office/word/2010/wordprocessingShape" xmlns:wpg="http://schemas.microsoft.com/office/word/2010/wordprocessingGroup" xmlns:mc="http://schemas.openxmlformats.org/markup-compatibility/2006" xmlns:wp14="http://schemas.microsoft.com/office/word/2010/wordprocessingDrawing" xmlns:w14="http://schemas.microsoft.com/office/word/2010/wordml" xmlns:w15="http://schemas.microsoft.com/office/word/2012/wordml" mc:Ignorable="w14 wp14 w15">
+  <w:p>
+    <w:pPr>
+      <w:pStyle w:val="Footer"/>
+      <w:jc w:val="center"/>
+      <w:rPr/>
+    </w:pPr>
+    <w:bookmarkStart w:id="0" w:name="PageNumWizard_FOOTER_Default_Page_Style2"/>
+    <w:r>
+      <w:rPr/>
+      <w:fldChar w:fldCharType="begin"/>
+    </w:r>
+    <w:r>
+      <w:rPr/>
+      <w:instrText xml:space="preserve"> PAGE </w:instrText>
+    </w:r>
+    <w:r>
+      <w:rPr/>
+      <w:fldChar w:fldCharType="separate"/>
+    </w:r>
+    <w:r>
+      <w:rPr/>
+      <w:t>6</w:t>
+    </w:r>
+    <w:r>
+      <w:rPr/>
+      <w:fldChar w:fldCharType="end"/>
+    </w:r>
+    <w:bookmarkEnd w:id="0"/>
+  </w:p>
+</w:ftr>
+</file>
+
+<file path=word/footer2.xml><?xml version="1.0" encoding="utf-8"?>
+<w:ftr xmlns:o="urn:schemas-microsoft-com:office:office" xmlns:r="http://schemas.openxmlformats.org/officeDocument/2006/relationships" xmlns:v="urn:schemas-microsoft-com:vml" xmlns:w="http://schemas.openxmlformats.org/wordprocessingml/2006/main" xmlns:w10="urn:schemas-microsoft-com:office:word" xmlns:wp="http://schemas.openxmlformats.org/drawingml/2006/wordprocessingDrawing" xmlns:wps="http://schemas.microsoft.com/office/word/2010/wordprocessingShape" xmlns:wpg="http://schemas.microsoft.com/office/word/2010/wordprocessingGroup" xmlns:mc="http://schemas.openxmlformats.org/markup-compatibility/2006" xmlns:wp14="http://schemas.microsoft.com/office/word/2010/wordprocessingDrawing" xmlns:w14="http://schemas.microsoft.com/office/word/2010/wordml" xmlns:w15="http://schemas.microsoft.com/office/word/2012/wordml" mc:Ignorable="w14 wp14 w15">
+  <w:p>
+    <w:pPr>
+      <w:pStyle w:val="Footer"/>
+      <w:jc w:val="center"/>
+      <w:rPr/>
+    </w:pPr>
+    <w:bookmarkStart w:id="1" w:name="PageNumWizard_FOOTER_Default_Page_Style3"/>
+    <w:r>
+      <w:rPr/>
+      <w:fldChar w:fldCharType="begin"/>
+    </w:r>
+    <w:r>
+      <w:rPr/>
+      <w:instrText xml:space="preserve"> PAGE </w:instrText>
+    </w:r>
+    <w:r>
+      <w:rPr/>
+      <w:fldChar w:fldCharType="separate"/>
+    </w:r>
+    <w:r>
+      <w:rPr/>
+      <w:t>5</w:t>
+    </w:r>
+    <w:r>
+      <w:rPr/>
+      <w:fldChar w:fldCharType="end"/>
+    </w:r>
+    <w:bookmarkEnd w:id="1"/>
+  </w:p>
+</w:ftr>
+</file>
+
 <file path=word/numbering.xml><?xml version="1.0" encoding="utf-8"?>
 <w:numbering xmlns:w="http://schemas.openxmlformats.org/wordprocessingml/2006/main" xmlns:o="urn:schemas-microsoft-com:office:office" xmlns:r="http://schemas.openxmlformats.org/officeDocument/2006/relationships" xmlns:v="urn:schemas-microsoft-com:vml" xmlns:mc="http://schemas.openxmlformats.org/markup-compatibility/2006" xmlns:w14="http://schemas.microsoft.com/office/word/2010/wordml" mc:Ignorable="w14">
   <w:abstractNum w:abstractNumId="1">
@@ -3300,6 +3719,143 @@
     </w:lvl>
   </w:abstractNum>
   <w:abstractNum w:abstractNumId="6">
+    <w:lvl w:ilvl="0">
+      <w:start w:val="1"/>
+      <w:numFmt w:val="bullet"/>
+      <w:lvlText w:val=""/>
+      <w:lvlJc w:val="start"/>
+      <w:pPr>
+        <w:tabs>
+          <w:tab w:val="num" w:pos="720"/>
+        </w:tabs>
+        <w:ind w:start="720" w:hanging="360"/>
+      </w:pPr>
+      <w:rPr>
+        <w:rFonts w:ascii="Symbol" w:hAnsi="Symbol" w:cs="Symbol" w:hint="default"/>
+      </w:rPr>
+    </w:lvl>
+    <w:lvl w:ilvl="1">
+      <w:start w:val="1"/>
+      <w:numFmt w:val="bullet"/>
+      <w:lvlText w:val="◦"/>
+      <w:lvlJc w:val="start"/>
+      <w:pPr>
+        <w:tabs>
+          <w:tab w:val="num" w:pos="1080"/>
+        </w:tabs>
+        <w:ind w:start="1080" w:hanging="360"/>
+      </w:pPr>
+      <w:rPr>
+        <w:rFonts w:ascii="OpenSymbol" w:hAnsi="OpenSymbol" w:cs="OpenSymbol" w:hint="default"/>
+      </w:rPr>
+    </w:lvl>
+    <w:lvl w:ilvl="2">
+      <w:start w:val="1"/>
+      <w:numFmt w:val="bullet"/>
+      <w:lvlText w:val="▪"/>
+      <w:lvlJc w:val="start"/>
+      <w:pPr>
+        <w:tabs>
+          <w:tab w:val="num" w:pos="1440"/>
+        </w:tabs>
+        <w:ind w:start="1440" w:hanging="360"/>
+      </w:pPr>
+      <w:rPr>
+        <w:rFonts w:ascii="OpenSymbol" w:hAnsi="OpenSymbol" w:cs="OpenSymbol" w:hint="default"/>
+      </w:rPr>
+    </w:lvl>
+    <w:lvl w:ilvl="3">
+      <w:start w:val="1"/>
+      <w:numFmt w:val="bullet"/>
+      <w:lvlText w:val=""/>
+      <w:lvlJc w:val="start"/>
+      <w:pPr>
+        <w:tabs>
+          <w:tab w:val="num" w:pos="1800"/>
+        </w:tabs>
+        <w:ind w:start="1800" w:hanging="360"/>
+      </w:pPr>
+      <w:rPr>
+        <w:rFonts w:ascii="Symbol" w:hAnsi="Symbol" w:cs="Symbol" w:hint="default"/>
+      </w:rPr>
+    </w:lvl>
+    <w:lvl w:ilvl="4">
+      <w:start w:val="1"/>
+      <w:numFmt w:val="bullet"/>
+      <w:lvlText w:val="◦"/>
+      <w:lvlJc w:val="start"/>
+      <w:pPr>
+        <w:tabs>
+          <w:tab w:val="num" w:pos="2160"/>
+        </w:tabs>
+        <w:ind w:start="2160" w:hanging="360"/>
+      </w:pPr>
+      <w:rPr>
+        <w:rFonts w:ascii="OpenSymbol" w:hAnsi="OpenSymbol" w:cs="OpenSymbol" w:hint="default"/>
+      </w:rPr>
+    </w:lvl>
+    <w:lvl w:ilvl="5">
+      <w:start w:val="1"/>
+      <w:numFmt w:val="bullet"/>
+      <w:lvlText w:val="▪"/>
+      <w:lvlJc w:val="start"/>
+      <w:pPr>
+        <w:tabs>
+          <w:tab w:val="num" w:pos="2520"/>
+        </w:tabs>
+        <w:ind w:start="2520" w:hanging="360"/>
+      </w:pPr>
+      <w:rPr>
+        <w:rFonts w:ascii="OpenSymbol" w:hAnsi="OpenSymbol" w:cs="OpenSymbol" w:hint="default"/>
+      </w:rPr>
+    </w:lvl>
+    <w:lvl w:ilvl="6">
+      <w:start w:val="1"/>
+      <w:numFmt w:val="bullet"/>
+      <w:lvlText w:val=""/>
+      <w:lvlJc w:val="start"/>
+      <w:pPr>
+        <w:tabs>
+          <w:tab w:val="num" w:pos="2880"/>
+        </w:tabs>
+        <w:ind w:start="2880" w:hanging="360"/>
+      </w:pPr>
+      <w:rPr>
+        <w:rFonts w:ascii="Symbol" w:hAnsi="Symbol" w:cs="Symbol" w:hint="default"/>
+      </w:rPr>
+    </w:lvl>
+    <w:lvl w:ilvl="7">
+      <w:start w:val="1"/>
+      <w:numFmt w:val="bullet"/>
+      <w:lvlText w:val="◦"/>
+      <w:lvlJc w:val="start"/>
+      <w:pPr>
+        <w:tabs>
+          <w:tab w:val="num" w:pos="3240"/>
+        </w:tabs>
+        <w:ind w:start="3240" w:hanging="360"/>
+      </w:pPr>
+      <w:rPr>
+        <w:rFonts w:ascii="OpenSymbol" w:hAnsi="OpenSymbol" w:cs="OpenSymbol" w:hint="default"/>
+      </w:rPr>
+    </w:lvl>
+    <w:lvl w:ilvl="8">
+      <w:start w:val="1"/>
+      <w:numFmt w:val="bullet"/>
+      <w:lvlText w:val="▪"/>
+      <w:lvlJc w:val="start"/>
+      <w:pPr>
+        <w:tabs>
+          <w:tab w:val="num" w:pos="3600"/>
+        </w:tabs>
+        <w:ind w:start="3600" w:hanging="360"/>
+      </w:pPr>
+      <w:rPr>
+        <w:rFonts w:ascii="OpenSymbol" w:hAnsi="OpenSymbol" w:cs="OpenSymbol" w:hint="default"/>
+      </w:rPr>
+    </w:lvl>
+  </w:abstractNum>
+  <w:abstractNum w:abstractNumId="7">
     <w:lvl w:ilvl="0">
       <w:start w:val="1"/>
       <w:numFmt w:val="none"/>
@@ -3435,6 +3991,9 @@
   </w:num>
   <w:num w:numId="6">
     <w:abstractNumId w:val="6"/>
+  </w:num>
+  <w:num w:numId="7">
+    <w:abstractNumId w:val="7"/>
   </w:num>
 </w:numbering>
 </file>
@@ -3564,6 +4123,42 @@
       <w:rFonts w:cs="Noto Sans Devanagari"/>
     </w:rPr>
   </w:style>
+  <w:style w:type="paragraph" w:styleId="HeaderandFooter">
+    <w:name w:val="Header and Footer"/>
+    <w:basedOn w:val="Normal"/>
+    <w:qFormat/>
+    <w:pPr>
+      <w:suppressLineNumbers/>
+      <w:tabs>
+        <w:tab w:val="clear" w:pos="709"/>
+        <w:tab w:val="center" w:pos="4819" w:leader="none"/>
+        <w:tab w:val="right" w:pos="9638" w:leader="none"/>
+      </w:tabs>
+    </w:pPr>
+    <w:rPr/>
+  </w:style>
+  <w:style w:type="paragraph" w:styleId="Footer">
+    <w:name w:val="Footer"/>
+    <w:basedOn w:val="HeaderandFooter"/>
+    <w:pPr>
+      <w:suppressLineNumbers/>
+    </w:pPr>
+    <w:rPr/>
+  </w:style>
+  <w:style w:type="paragraph" w:styleId="Header">
+    <w:name w:val="Header"/>
+    <w:basedOn w:val="HeaderandFooter"/>
+    <w:pPr>
+      <w:suppressLineNumbers/>
+      <w:tabs>
+        <w:tab w:val="clear" w:pos="4819"/>
+        <w:tab w:val="clear" w:pos="9638"/>
+        <w:tab w:val="center" w:pos="4986" w:leader="none"/>
+        <w:tab w:val="right" w:pos="9972" w:leader="none"/>
+      </w:tabs>
+    </w:pPr>
+    <w:rPr/>
+  </w:style>
 </w:styles>
 </file>
 

</xml_diff>

<commit_message>
Splitting "W" from "D".
</commit_message>
<xml_diff>
--- a/Documentation/Manual/Gilboa Water Temperature Monitor.docx
+++ b/Documentation/Manual/Gilboa Water Temperature Monitor.docx
@@ -1993,21 +1993,7 @@
           <w:b w:val="false"/>
           <w:bCs w:val="false"/>
         </w:rPr>
-        <w:t>From a web browser, go to the site “192.168.</w:t>
-      </w:r>
-      <w:r>
-        <w:rPr>
-          <w:b w:val="false"/>
-          <w:bCs w:val="false"/>
-        </w:rPr>
-        <w:t>4</w:t>
-      </w:r>
-      <w:r>
-        <w:rPr>
-          <w:b w:val="false"/>
-          <w:bCs w:val="false"/>
-        </w:rPr>
-        <w:t>.2/update”, to connect to the Sender unit.</w:t>
+        <w:t>From a web browser, go to the site “192.168.4.2/update”, to connect to the Sender unit.</w:t>
       </w:r>
     </w:p>
     <w:p>
@@ -2986,7 +2972,7 @@
     </w:r>
     <w:r>
       <w:rPr/>
-      <w:t>6</w:t>
+      <w:t>4</w:t>
     </w:r>
     <w:r>
       <w:rPr/>
@@ -4022,7 +4008,7 @@
     <w:pPr>
       <w:widowControl/>
       <w:suppressAutoHyphens w:val="true"/>
-      <w:overflowPunct w:val="false"/>
+      <w:overflowPunct w:val="true"/>
       <w:bidi w:val="0"/>
       <w:spacing w:before="0" w:after="0"/>
       <w:jc w:val="start"/>

</xml_diff>

<commit_message>
Reset ESP32 on a LoRa failure on setup.
</commit_message>
<xml_diff>
--- a/Documentation/Manual/Gilboa Water Temperature Monitor.docx
+++ b/Documentation/Manual/Gilboa Water Temperature Monitor.docx
@@ -1294,9 +1294,17 @@
           <w:shd w:fill="FFFFFF" w:val="clear"/>
         </w:rPr>
         <w:tab/>
-        <w:t xml:space="preserve"> </w:t>
-        <w:tab/>
-        <w:t>Receiver Version</w:t>
+        <w:tab/>
+      </w:r>
+      <w:r>
+        <w:rPr>
+          <w:rFonts w:ascii="Droid Sans Mono;monospace" w:hAnsi="Droid Sans Mono;monospace"/>
+          <w:b w:val="false"/>
+          <w:color w:val="008000"/>
+          <w:sz w:val="21"/>
+          <w:shd w:fill="FFFFFF" w:val="clear"/>
+        </w:rPr>
+        <w:t>Sender WDT counter (current/previous)</w:t>
       </w:r>
     </w:p>
     <w:p>
@@ -1324,7 +1332,7 @@
         </w:rPr>
         <w:tab/>
         <w:tab/>
-        <w:t>Receiver CPU Temperature</w:t>
+        <w:t>Sender WDT Enabled state</w:t>
       </w:r>
     </w:p>
     <w:p>
@@ -1351,9 +1359,8 @@
           <w:shd w:fill="FFFFFF" w:val="clear"/>
         </w:rPr>
         <w:tab/>
-        <w:t xml:space="preserve"> </w:t>
-        <w:tab/>
-        <w:t>Water detection status at lower sensor and upper sensor</w:t>
+        <w:tab/>
+        <w:t>Sleep timer status (running time / set sleep time for sender)</w:t>
       </w:r>
     </w:p>
     <w:p>
@@ -1382,7 +1389,7 @@
         <w:tab/>
         <w:t xml:space="preserve"> </w:t>
         <w:tab/>
-        <w:t>HTTP Status Code of last POST request to postUrl</w:t>
+        <w:t>Receiver Version</w:t>
       </w:r>
     </w:p>
     <w:p>
@@ -1409,9 +1416,66 @@
           <w:shd w:fill="FFFFFF" w:val="clear"/>
         </w:rPr>
         <w:tab/>
+        <w:tab/>
+        <w:t>Receiver CPU Temperature</w:t>
+      </w:r>
+    </w:p>
+    <w:p>
+      <w:pPr>
+        <w:pStyle w:val="Normal"/>
+        <w:bidi w:val="0"/>
+        <w:spacing w:lineRule="atLeast" w:line="285"/>
+        <w:ind w:hanging="0" w:start="0" w:end="0"/>
+        <w:jc w:val="start"/>
+        <w:rPr>
+          <w:rFonts w:ascii="Droid Sans Mono;monospace" w:hAnsi="Droid Sans Mono;monospace"/>
+          <w:b w:val="false"/>
+          <w:color w:val="008000"/>
+          <w:sz w:val="21"/>
+          <w:shd w:fill="FFFFFF" w:val="clear"/>
+        </w:rPr>
+      </w:pPr>
+      <w:r>
+        <w:rPr>
+          <w:rFonts w:ascii="Droid Sans Mono;monospace" w:hAnsi="Droid Sans Mono;monospace"/>
+          <w:b w:val="false"/>
+          <w:color w:val="008000"/>
+          <w:sz w:val="21"/>
+          <w:shd w:fill="FFFFFF" w:val="clear"/>
+        </w:rPr>
+        <w:tab/>
         <w:t xml:space="preserve"> </w:t>
         <w:tab/>
-        <w:t>Sleep timer status (running time / set sleep time for sender)</w:t>
+        <w:t>Water detection status at lower sensor and upper sensor</w:t>
+      </w:r>
+    </w:p>
+    <w:p>
+      <w:pPr>
+        <w:pStyle w:val="Normal"/>
+        <w:bidi w:val="0"/>
+        <w:spacing w:lineRule="atLeast" w:line="285"/>
+        <w:ind w:hanging="0" w:start="0" w:end="0"/>
+        <w:jc w:val="start"/>
+        <w:rPr>
+          <w:rFonts w:ascii="Droid Sans Mono;monospace" w:hAnsi="Droid Sans Mono;monospace"/>
+          <w:b w:val="false"/>
+          <w:color w:val="008000"/>
+          <w:sz w:val="21"/>
+          <w:shd w:fill="FFFFFF" w:val="clear"/>
+        </w:rPr>
+      </w:pPr>
+      <w:r>
+        <w:rPr>
+          <w:rFonts w:ascii="Droid Sans Mono;monospace" w:hAnsi="Droid Sans Mono;monospace"/>
+          <w:b w:val="false"/>
+          <w:color w:val="008000"/>
+          <w:sz w:val="21"/>
+          <w:shd w:fill="FFFFFF" w:val="clear"/>
+        </w:rPr>
+        <w:tab/>
+        <w:t xml:space="preserve"> </w:t>
+        <w:tab/>
+        <w:t>HTTP Status Code of last POST request to postUrl</w:t>
       </w:r>
     </w:p>
     <w:p>
@@ -2877,20 +2941,8 @@
           <w:szCs w:val="24"/>
           <w:lang w:val="en-US" w:eastAsia="zh-CN" w:bidi="hi-IN"/>
         </w:rPr>
-        <w:t xml:space="preserve">  “Release 2 - Receiver v1.3.02 - Sender v1.2.03”).</w:t>
-      </w:r>
-    </w:p>
-    <w:p>
-      <w:pPr>
-        <w:pStyle w:val="Normal"/>
-        <w:numPr>
-          <w:ilvl w:val="1"/>
-          <w:numId w:val="6"/>
-        </w:numPr>
-        <w:bidi w:val="0"/>
-        <w:jc w:val="start"/>
-        <w:rPr/>
-      </w:pPr>
+        <w:t xml:space="preserve">  “Release </w:t>
+      </w:r>
       <w:r>
         <w:rPr>
           <w:rFonts w:eastAsia="Noto Serif CJK SC" w:cs="Noto Sans Devanagari"/>
@@ -2902,7 +2954,71 @@
           <w:szCs w:val="24"/>
           <w:lang w:val="en-US" w:eastAsia="zh-CN" w:bidi="hi-IN"/>
         </w:rPr>
-        <w:t>Attach the binaries (firmware.bin) for the Receiver and Sender. Renaming them with their corresponding target (Receiver_irmware.bin and Sender_firmware.bin).</w:t>
+        <w:t>4</w:t>
+      </w:r>
+      <w:r>
+        <w:rPr>
+          <w:rFonts w:eastAsia="Noto Serif CJK SC" w:cs="Noto Sans Devanagari"/>
+          <w:b w:val="false"/>
+          <w:bCs w:val="false"/>
+          <w:color w:val="auto"/>
+          <w:kern w:val="2"/>
+          <w:sz w:val="24"/>
+          <w:szCs w:val="24"/>
+          <w:lang w:val="en-US" w:eastAsia="zh-CN" w:bidi="hi-IN"/>
+        </w:rPr>
+        <w:t xml:space="preserve"> - Receiver v1.3.02 - Sender v1.2.03”).</w:t>
+      </w:r>
+    </w:p>
+    <w:p>
+      <w:pPr>
+        <w:pStyle w:val="Normal"/>
+        <w:numPr>
+          <w:ilvl w:val="1"/>
+          <w:numId w:val="6"/>
+        </w:numPr>
+        <w:bidi w:val="0"/>
+        <w:jc w:val="start"/>
+        <w:rPr/>
+      </w:pPr>
+      <w:r>
+        <w:rPr>
+          <w:rFonts w:eastAsia="Noto Serif CJK SC" w:cs="Noto Sans Devanagari"/>
+          <w:b w:val="false"/>
+          <w:bCs w:val="false"/>
+          <w:color w:val="auto"/>
+          <w:kern w:val="2"/>
+          <w:sz w:val="24"/>
+          <w:szCs w:val="24"/>
+          <w:lang w:val="en-US" w:eastAsia="zh-CN" w:bidi="hi-IN"/>
+        </w:rPr>
+        <w:t>Attach the binaries (firmware.bin) for the Receiver and Sender. Renaming them with their corresponding target (Receiver_</w:t>
+      </w:r>
+      <w:r>
+        <w:rPr>
+          <w:rFonts w:eastAsia="Noto Serif CJK SC" w:cs="Noto Sans Devanagari"/>
+          <w:b w:val="false"/>
+          <w:bCs w:val="false"/>
+          <w:color w:val="auto"/>
+          <w:kern w:val="2"/>
+          <w:sz w:val="24"/>
+          <w:szCs w:val="24"/>
+          <w:lang w:val="en-US" w:eastAsia="zh-CN" w:bidi="hi-IN"/>
+        </w:rPr>
+        <w:t>f</w:t>
+      </w:r>
+      <w:r>
+        <w:rPr>
+          <w:rFonts w:eastAsia="Noto Serif CJK SC" w:cs="Noto Sans Devanagari"/>
+          <w:b w:val="false"/>
+          <w:bCs w:val="false"/>
+          <w:color w:val="auto"/>
+          <w:kern w:val="2"/>
+          <w:sz w:val="24"/>
+          <w:szCs w:val="24"/>
+          <w:lang w:val="en-US" w:eastAsia="zh-CN" w:bidi="hi-IN"/>
+        </w:rPr>
+        <w:t>irmware.bin and Sender_firmware.bin).</w:t>
       </w:r>
     </w:p>
     <w:p>
@@ -3006,7 +3122,7 @@
     </w:r>
     <w:r>
       <w:rPr/>
-      <w:t>5</w:t>
+      <w:t>3</w:t>
     </w:r>
     <w:r>
       <w:rPr/>
@@ -4008,7 +4124,7 @@
     <w:pPr>
       <w:widowControl/>
       <w:suppressAutoHyphens w:val="true"/>
-      <w:overflowPunct w:val="true"/>
+      <w:overflowPunct w:val="false"/>
       <w:bidi w:val="0"/>
       <w:spacing w:before="0" w:after="0"/>
       <w:jc w:val="start"/>

</xml_diff>